<commit_message>
slowly but surely developing
</commit_message>
<xml_diff>
--- a/Documentation Individual/Project Analysis.docx
+++ b/Documentation Individual/Project Analysis.docx
@@ -5,6 +5,7 @@
     <w:p>
       <w:pPr>
         <w:pStyle w:val="Title"/>
+        <w:jc w:val="center"/>
       </w:pPr>
       <w:r>
         <w:t>Project Analysis</w:t>
@@ -3100,6 +3101,7 @@
         <w:pStyle w:val="Heading2"/>
       </w:pPr>
       <w:bookmarkStart w:id="4" w:name="_Toc192628978"/>
+      <w:bookmarkStart w:id="5" w:name="_Hlk193275544"/>
       <w:r>
         <w:t>Use Case</w:t>
       </w:r>
@@ -3128,7 +3130,14 @@
           <w:sz w:val="24"/>
           <w:szCs w:val="24"/>
         </w:rPr>
-        <w:t>Primary Actor: User</w:t>
+        <w:t xml:space="preserve">Primary Actor: </w:t>
+      </w:r>
+      <w:r>
+        <w:rPr>
+          <w:sz w:val="24"/>
+          <w:szCs w:val="24"/>
+        </w:rPr>
+        <w:t>Movie watcher</w:t>
       </w:r>
     </w:p>
     <w:p>
@@ -3175,7 +3184,7 @@
       <w:pPr>
         <w:pStyle w:val="Heading3"/>
       </w:pPr>
-      <w:bookmarkStart w:id="5" w:name="_Toc192628979"/>
+      <w:bookmarkStart w:id="6" w:name="_Toc192628979"/>
       <w:r>
         <w:t>Stakeholder &amp;</w:t>
       </w:r>
@@ -3185,7 +3194,7 @@
       <w:r>
         <w:t>Interests:</w:t>
       </w:r>
-      <w:bookmarkEnd w:id="5"/>
+      <w:bookmarkEnd w:id="6"/>
     </w:p>
     <w:p>
       <w:pPr>
@@ -3238,11 +3247,11 @@
       <w:pPr>
         <w:pStyle w:val="Heading3"/>
       </w:pPr>
-      <w:bookmarkStart w:id="6" w:name="_Toc192628980"/>
+      <w:bookmarkStart w:id="7" w:name="_Toc192628980"/>
       <w:r>
         <w:t>Preconditions:</w:t>
       </w:r>
-      <w:bookmarkEnd w:id="6"/>
+      <w:bookmarkEnd w:id="7"/>
     </w:p>
     <w:p>
       <w:pPr>
@@ -3275,11 +3284,11 @@
       <w:pPr>
         <w:pStyle w:val="Heading3"/>
       </w:pPr>
-      <w:bookmarkStart w:id="7" w:name="_Toc192628981"/>
+      <w:bookmarkStart w:id="8" w:name="_Toc192628981"/>
       <w:r>
         <w:t>Guarantees:</w:t>
       </w:r>
-      <w:bookmarkEnd w:id="7"/>
+      <w:bookmarkEnd w:id="8"/>
     </w:p>
     <w:p>
       <w:pPr>
@@ -3345,11 +3354,11 @@
       <w:pPr>
         <w:pStyle w:val="Heading3"/>
       </w:pPr>
-      <w:bookmarkStart w:id="8" w:name="_Toc192628982"/>
+      <w:bookmarkStart w:id="9" w:name="_Toc192628982"/>
       <w:r>
         <w:t>Main success scenario:</w:t>
       </w:r>
-      <w:bookmarkEnd w:id="8"/>
+      <w:bookmarkEnd w:id="9"/>
     </w:p>
     <w:p>
       <w:pPr>
@@ -3451,11 +3460,11 @@
       <w:pPr>
         <w:pStyle w:val="Heading3"/>
       </w:pPr>
-      <w:bookmarkStart w:id="9" w:name="_Toc192628983"/>
+      <w:bookmarkStart w:id="10" w:name="_Toc192628983"/>
       <w:r>
         <w:t>Extensions:</w:t>
       </w:r>
-      <w:bookmarkEnd w:id="9"/>
+      <w:bookmarkEnd w:id="10"/>
     </w:p>
     <w:p>
       <w:pPr>
@@ -3671,6 +3680,7 @@
         <w:t xml:space="preserve"> to provide a different username or log in</w:t>
       </w:r>
     </w:p>
+    <w:bookmarkEnd w:id="5"/>
     <w:p>
       <w:pPr>
         <w:rPr>
@@ -3690,7 +3700,7 @@
       <w:pPr>
         <w:pStyle w:val="Heading2"/>
       </w:pPr>
-      <w:bookmarkStart w:id="10" w:name="_Toc192628984"/>
+      <w:bookmarkStart w:id="11" w:name="_Toc192628984"/>
       <w:r>
         <w:lastRenderedPageBreak/>
         <w:t>Use Case</w:t>
@@ -3701,7 +3711,7 @@
       <w:r>
         <w:t>Logs in</w:t>
       </w:r>
-      <w:bookmarkEnd w:id="10"/>
+      <w:bookmarkEnd w:id="11"/>
     </w:p>
     <w:p>
       <w:pPr>
@@ -3720,7 +3730,14 @@
           <w:sz w:val="24"/>
           <w:szCs w:val="24"/>
         </w:rPr>
-        <w:t>Primary Actor: User</w:t>
+        <w:t xml:space="preserve">Primary Actor: </w:t>
+      </w:r>
+      <w:r>
+        <w:rPr>
+          <w:sz w:val="24"/>
+          <w:szCs w:val="24"/>
+        </w:rPr>
+        <w:t>Movie watcher</w:t>
       </w:r>
     </w:p>
     <w:p>
@@ -3767,11 +3784,11 @@
       <w:pPr>
         <w:pStyle w:val="Heading3"/>
       </w:pPr>
-      <w:bookmarkStart w:id="11" w:name="_Toc192628985"/>
+      <w:bookmarkStart w:id="12" w:name="_Toc192628985"/>
       <w:r>
         <w:t>Stakeholder &amp; Interests:</w:t>
       </w:r>
-      <w:bookmarkEnd w:id="11"/>
+      <w:bookmarkEnd w:id="12"/>
     </w:p>
     <w:p>
       <w:pPr>
@@ -3831,11 +3848,11 @@
       <w:pPr>
         <w:pStyle w:val="Heading3"/>
       </w:pPr>
-      <w:bookmarkStart w:id="12" w:name="_Toc192628986"/>
+      <w:bookmarkStart w:id="13" w:name="_Toc192628986"/>
       <w:r>
         <w:t>Preconditions:</w:t>
       </w:r>
-      <w:bookmarkEnd w:id="12"/>
+      <w:bookmarkEnd w:id="13"/>
     </w:p>
     <w:p>
       <w:pPr>
@@ -3861,11 +3878,11 @@
       <w:pPr>
         <w:pStyle w:val="Heading3"/>
       </w:pPr>
-      <w:bookmarkStart w:id="13" w:name="_Toc192628987"/>
+      <w:bookmarkStart w:id="14" w:name="_Toc192628987"/>
       <w:r>
         <w:t>Guarantees:</w:t>
       </w:r>
-      <w:bookmarkEnd w:id="13"/>
+      <w:bookmarkEnd w:id="14"/>
     </w:p>
     <w:p>
       <w:pPr>
@@ -3931,11 +3948,11 @@
       <w:pPr>
         <w:pStyle w:val="Heading3"/>
       </w:pPr>
-      <w:bookmarkStart w:id="14" w:name="_Toc192628988"/>
+      <w:bookmarkStart w:id="15" w:name="_Toc192628988"/>
       <w:r>
         <w:t>Main success scenario:</w:t>
       </w:r>
-      <w:bookmarkEnd w:id="14"/>
+      <w:bookmarkEnd w:id="15"/>
     </w:p>
     <w:p>
       <w:pPr>
@@ -4067,11 +4084,11 @@
       <w:pPr>
         <w:pStyle w:val="Heading3"/>
       </w:pPr>
-      <w:bookmarkStart w:id="15" w:name="_Toc192628989"/>
+      <w:bookmarkStart w:id="16" w:name="_Toc192628989"/>
       <w:r>
         <w:t>Extensions:</w:t>
       </w:r>
-      <w:bookmarkEnd w:id="15"/>
+      <w:bookmarkEnd w:id="16"/>
     </w:p>
     <w:p>
       <w:pPr>
@@ -4259,7 +4276,7 @@
       <w:pPr>
         <w:pStyle w:val="Heading2"/>
       </w:pPr>
-      <w:bookmarkStart w:id="16" w:name="_Toc192628990"/>
+      <w:bookmarkStart w:id="17" w:name="_Toc192628990"/>
       <w:r>
         <w:lastRenderedPageBreak/>
         <w:t>Use Case</w:t>
@@ -4268,12 +4285,9 @@
         <w:t xml:space="preserve">: User </w:t>
       </w:r>
       <w:r>
-        <w:t xml:space="preserve">Logs </w:t>
-      </w:r>
-      <w:r>
-        <w:t>out</w:t>
-      </w:r>
-      <w:bookmarkEnd w:id="16"/>
+        <w:t>Logs out</w:t>
+      </w:r>
+      <w:bookmarkEnd w:id="17"/>
     </w:p>
     <w:p>
       <w:pPr>
@@ -4292,7 +4306,14 @@
           <w:sz w:val="24"/>
           <w:szCs w:val="24"/>
         </w:rPr>
-        <w:t>Primary Actor: User</w:t>
+        <w:t xml:space="preserve">Primary Actor: </w:t>
+      </w:r>
+      <w:r>
+        <w:rPr>
+          <w:sz w:val="24"/>
+          <w:szCs w:val="24"/>
+        </w:rPr>
+        <w:t>Movie watcher</w:t>
       </w:r>
     </w:p>
     <w:p>
@@ -4339,11 +4360,11 @@
       <w:pPr>
         <w:pStyle w:val="Heading3"/>
       </w:pPr>
-      <w:bookmarkStart w:id="17" w:name="_Toc192628991"/>
+      <w:bookmarkStart w:id="18" w:name="_Toc192628991"/>
       <w:r>
         <w:t>Stakeholder &amp; Interests:</w:t>
       </w:r>
-      <w:bookmarkEnd w:id="17"/>
+      <w:bookmarkEnd w:id="18"/>
     </w:p>
     <w:p>
       <w:pPr>
@@ -4369,21 +4390,7 @@
           <w:sz w:val="24"/>
           <w:szCs w:val="24"/>
         </w:rPr>
-        <w:t xml:space="preserve">logs </w:t>
-      </w:r>
-      <w:r>
-        <w:rPr>
-          <w:sz w:val="24"/>
-          <w:szCs w:val="24"/>
-        </w:rPr>
-        <w:t>out</w:t>
-      </w:r>
-      <w:r>
-        <w:rPr>
-          <w:sz w:val="24"/>
-          <w:szCs w:val="24"/>
-        </w:rPr>
-        <w:t xml:space="preserve"> the movie night website</w:t>
+        <w:t>logs out the movie night website</w:t>
       </w:r>
     </w:p>
     <w:p>
@@ -4403,25 +4410,18 @@
           <w:sz w:val="24"/>
           <w:szCs w:val="24"/>
         </w:rPr>
-        <w:t xml:space="preserve">System </w:t>
-      </w:r>
-      <w:r>
-        <w:rPr>
-          <w:sz w:val="24"/>
-          <w:szCs w:val="24"/>
-        </w:rPr>
-        <w:t>ensures session and user data are not lost in the process</w:t>
+        <w:t>System ensures session and user data are not lost in the process</w:t>
       </w:r>
     </w:p>
     <w:p>
       <w:pPr>
         <w:pStyle w:val="Heading3"/>
       </w:pPr>
-      <w:bookmarkStart w:id="18" w:name="_Toc192628992"/>
+      <w:bookmarkStart w:id="19" w:name="_Toc192628992"/>
       <w:r>
         <w:t>Preconditions:</w:t>
       </w:r>
-      <w:bookmarkEnd w:id="18"/>
+      <w:bookmarkEnd w:id="19"/>
     </w:p>
     <w:p>
       <w:pPr>
@@ -4467,11 +4467,11 @@
       <w:pPr>
         <w:pStyle w:val="Heading3"/>
       </w:pPr>
-      <w:bookmarkStart w:id="19" w:name="_Toc192628993"/>
+      <w:bookmarkStart w:id="20" w:name="_Toc192628993"/>
       <w:r>
         <w:t>Guarantees:</w:t>
       </w:r>
-      <w:bookmarkEnd w:id="19"/>
+      <w:bookmarkEnd w:id="20"/>
     </w:p>
     <w:p>
       <w:pPr>
@@ -4490,14 +4490,7 @@
           <w:sz w:val="24"/>
           <w:szCs w:val="24"/>
         </w:rPr>
-        <w:t xml:space="preserve">System </w:t>
-      </w:r>
-      <w:r>
-        <w:rPr>
-          <w:sz w:val="24"/>
-          <w:szCs w:val="24"/>
-        </w:rPr>
-        <w:t>stores data of user in database</w:t>
+        <w:t>System stores data of user in database</w:t>
       </w:r>
     </w:p>
     <w:p>
@@ -4517,25 +4510,18 @@
           <w:sz w:val="24"/>
           <w:szCs w:val="24"/>
         </w:rPr>
-        <w:t xml:space="preserve">System </w:t>
-      </w:r>
-      <w:r>
-        <w:rPr>
-          <w:sz w:val="24"/>
-          <w:szCs w:val="24"/>
-        </w:rPr>
-        <w:t>secures data of user</w:t>
+        <w:t>System secures data of user</w:t>
       </w:r>
     </w:p>
     <w:p>
       <w:pPr>
         <w:pStyle w:val="Heading3"/>
       </w:pPr>
-      <w:bookmarkStart w:id="20" w:name="_Toc192628994"/>
+      <w:bookmarkStart w:id="21" w:name="_Toc192628994"/>
       <w:r>
         <w:t>Main success scenario:</w:t>
       </w:r>
-      <w:bookmarkEnd w:id="20"/>
+      <w:bookmarkEnd w:id="21"/>
     </w:p>
     <w:p>
       <w:pPr>
@@ -4550,21 +4536,7 @@
           <w:sz w:val="24"/>
           <w:szCs w:val="24"/>
         </w:rPr>
-        <w:t xml:space="preserve">User presses “Log </w:t>
-      </w:r>
-      <w:r>
-        <w:rPr>
-          <w:sz w:val="24"/>
-          <w:szCs w:val="24"/>
-        </w:rPr>
-        <w:t>out</w:t>
-      </w:r>
-      <w:r>
-        <w:rPr>
-          <w:sz w:val="24"/>
-          <w:szCs w:val="24"/>
-        </w:rPr>
-        <w:t>” button</w:t>
+        <w:t>User presses “Log out” button</w:t>
       </w:r>
     </w:p>
     <w:p>
@@ -4580,14 +4552,7 @@
           <w:sz w:val="24"/>
           <w:szCs w:val="24"/>
         </w:rPr>
-        <w:t xml:space="preserve">System </w:t>
-      </w:r>
-      <w:r>
-        <w:rPr>
-          <w:sz w:val="24"/>
-          <w:szCs w:val="24"/>
-        </w:rPr>
-        <w:t>confirms log out is successful</w:t>
+        <w:t>System confirms log out is successful</w:t>
       </w:r>
     </w:p>
     <w:p>
@@ -4603,32 +4568,18 @@
           <w:sz w:val="24"/>
           <w:szCs w:val="24"/>
         </w:rPr>
-        <w:t>System redirects user to “</w:t>
-      </w:r>
-      <w:r>
-        <w:rPr>
-          <w:sz w:val="24"/>
-          <w:szCs w:val="24"/>
-        </w:rPr>
-        <w:t>Log in</w:t>
-      </w:r>
-      <w:r>
-        <w:rPr>
-          <w:sz w:val="24"/>
-          <w:szCs w:val="24"/>
-        </w:rPr>
-        <w:t>” page of movie night website</w:t>
+        <w:t>System redirects user to “Log in” page of movie night website</w:t>
       </w:r>
     </w:p>
     <w:p>
       <w:pPr>
         <w:pStyle w:val="Heading3"/>
       </w:pPr>
-      <w:bookmarkStart w:id="21" w:name="_Toc192628995"/>
+      <w:bookmarkStart w:id="22" w:name="_Toc192628995"/>
       <w:r>
         <w:t>Extensions:</w:t>
       </w:r>
-      <w:bookmarkEnd w:id="21"/>
+      <w:bookmarkEnd w:id="22"/>
     </w:p>
     <w:p>
       <w:pPr>
@@ -4667,7 +4618,7 @@
       <w:pPr>
         <w:pStyle w:val="Heading2"/>
       </w:pPr>
-      <w:bookmarkStart w:id="22" w:name="_Toc192628996"/>
+      <w:bookmarkStart w:id="23" w:name="_Toc192628996"/>
       <w:r>
         <w:lastRenderedPageBreak/>
         <w:t>Use Case</w:t>
@@ -4687,7 +4638,7 @@
       <w:r>
         <w:t>suggestion pool</w:t>
       </w:r>
-      <w:bookmarkEnd w:id="22"/>
+      <w:bookmarkEnd w:id="23"/>
     </w:p>
     <w:p>
       <w:pPr>
@@ -4706,7 +4657,14 @@
           <w:sz w:val="24"/>
           <w:szCs w:val="24"/>
         </w:rPr>
-        <w:t>Primary Actor: User</w:t>
+        <w:t xml:space="preserve">Primary Actor: </w:t>
+      </w:r>
+      <w:r>
+        <w:rPr>
+          <w:sz w:val="24"/>
+          <w:szCs w:val="24"/>
+        </w:rPr>
+        <w:t>Movie watcher</w:t>
       </w:r>
     </w:p>
     <w:p>
@@ -4753,11 +4711,11 @@
       <w:pPr>
         <w:pStyle w:val="Heading3"/>
       </w:pPr>
-      <w:bookmarkStart w:id="23" w:name="_Toc192628997"/>
+      <w:bookmarkStart w:id="24" w:name="_Toc192628997"/>
       <w:r>
         <w:t>Stakeholder &amp; Interests:</w:t>
       </w:r>
-      <w:bookmarkEnd w:id="23"/>
+      <w:bookmarkEnd w:id="24"/>
     </w:p>
     <w:p>
       <w:pPr>
@@ -4803,14 +4761,7 @@
           <w:sz w:val="24"/>
           <w:szCs w:val="24"/>
         </w:rPr>
-        <w:t xml:space="preserve">System </w:t>
-      </w:r>
-      <w:r>
-        <w:rPr>
-          <w:sz w:val="24"/>
-          <w:szCs w:val="24"/>
-        </w:rPr>
-        <w:t xml:space="preserve">adds movie to the </w:t>
+        <w:t xml:space="preserve">System adds movie to the </w:t>
       </w:r>
       <w:r>
         <w:rPr>
@@ -4871,11 +4822,11 @@
       <w:pPr>
         <w:pStyle w:val="Heading3"/>
       </w:pPr>
-      <w:bookmarkStart w:id="24" w:name="_Toc192628998"/>
+      <w:bookmarkStart w:id="25" w:name="_Toc192628998"/>
       <w:r>
         <w:t>Preconditions:</w:t>
       </w:r>
-      <w:bookmarkEnd w:id="24"/>
+      <w:bookmarkEnd w:id="25"/>
     </w:p>
     <w:p>
       <w:pPr>
@@ -4894,14 +4845,7 @@
           <w:sz w:val="24"/>
           <w:szCs w:val="24"/>
         </w:rPr>
-        <w:t>User must have an account</w:t>
-      </w:r>
-      <w:r>
-        <w:rPr>
-          <w:sz w:val="24"/>
-          <w:szCs w:val="24"/>
-        </w:rPr>
-        <w:t xml:space="preserve"> </w:t>
+        <w:t xml:space="preserve">User must have an account </w:t>
       </w:r>
     </w:p>
     <w:p>
@@ -4948,11 +4892,11 @@
       <w:pPr>
         <w:pStyle w:val="Heading3"/>
       </w:pPr>
-      <w:bookmarkStart w:id="25" w:name="_Toc192628999"/>
+      <w:bookmarkStart w:id="26" w:name="_Toc192628999"/>
       <w:r>
         <w:t>Guarantees:</w:t>
       </w:r>
-      <w:bookmarkEnd w:id="25"/>
+      <w:bookmarkEnd w:id="26"/>
     </w:p>
     <w:p>
       <w:pPr>
@@ -4971,14 +4915,7 @@
           <w:sz w:val="24"/>
           <w:szCs w:val="24"/>
         </w:rPr>
-        <w:t xml:space="preserve">System </w:t>
-      </w:r>
-      <w:r>
-        <w:rPr>
-          <w:sz w:val="24"/>
-          <w:szCs w:val="24"/>
-        </w:rPr>
-        <w:t>adds movie to the list</w:t>
+        <w:t>System adds movie to the list</w:t>
       </w:r>
     </w:p>
     <w:p>
@@ -4998,14 +4935,7 @@
           <w:sz w:val="24"/>
           <w:szCs w:val="24"/>
         </w:rPr>
-        <w:t xml:space="preserve">System remembers </w:t>
-      </w:r>
-      <w:r>
-        <w:rPr>
-          <w:sz w:val="24"/>
-          <w:szCs w:val="24"/>
-        </w:rPr>
-        <w:t>which user added the movie to the</w:t>
+        <w:t>System remembers which user added the movie to the</w:t>
       </w:r>
       <w:r>
         <w:rPr>
@@ -5026,11 +4956,11 @@
       <w:pPr>
         <w:pStyle w:val="Heading3"/>
       </w:pPr>
-      <w:bookmarkStart w:id="26" w:name="_Toc192629000"/>
+      <w:bookmarkStart w:id="27" w:name="_Toc192629000"/>
       <w:r>
         <w:t>Main success scenario:</w:t>
       </w:r>
-      <w:bookmarkEnd w:id="26"/>
+      <w:bookmarkEnd w:id="27"/>
     </w:p>
     <w:p>
       <w:pPr>
@@ -5045,21 +4975,7 @@
           <w:sz w:val="24"/>
           <w:szCs w:val="24"/>
         </w:rPr>
-        <w:t>User presses “</w:t>
-      </w:r>
-      <w:r>
-        <w:rPr>
-          <w:sz w:val="24"/>
-          <w:szCs w:val="24"/>
-        </w:rPr>
-        <w:t>Add movie</w:t>
-      </w:r>
-      <w:r>
-        <w:rPr>
-          <w:sz w:val="24"/>
-          <w:szCs w:val="24"/>
-        </w:rPr>
-        <w:t>” button</w:t>
+        <w:t>User presses “Add movie” button</w:t>
       </w:r>
     </w:p>
     <w:p>
@@ -5075,21 +4991,7 @@
           <w:sz w:val="24"/>
           <w:szCs w:val="24"/>
         </w:rPr>
-        <w:t xml:space="preserve">System </w:t>
-      </w:r>
-      <w:r>
-        <w:rPr>
-          <w:sz w:val="24"/>
-          <w:szCs w:val="24"/>
-        </w:rPr>
-        <w:t>displays add movie page and</w:t>
-      </w:r>
-      <w:r>
-        <w:rPr>
-          <w:sz w:val="24"/>
-          <w:szCs w:val="24"/>
-        </w:rPr>
-        <w:t xml:space="preserve"> form</w:t>
+        <w:t>System displays add movie page and form</w:t>
       </w:r>
     </w:p>
     <w:p>
@@ -5105,35 +5007,7 @@
           <w:sz w:val="24"/>
           <w:szCs w:val="24"/>
         </w:rPr>
-        <w:t xml:space="preserve">User fills </w:t>
-      </w:r>
-      <w:r>
-        <w:rPr>
-          <w:sz w:val="24"/>
-          <w:szCs w:val="24"/>
-        </w:rPr>
-        <w:t>in the</w:t>
-      </w:r>
-      <w:r>
-        <w:rPr>
-          <w:sz w:val="24"/>
-          <w:szCs w:val="24"/>
-        </w:rPr>
-        <w:t xml:space="preserve"> form</w:t>
-      </w:r>
-      <w:r>
-        <w:rPr>
-          <w:sz w:val="24"/>
-          <w:szCs w:val="24"/>
-        </w:rPr>
-        <w:t xml:space="preserve"> correctly</w:t>
-      </w:r>
-      <w:r>
-        <w:rPr>
-          <w:sz w:val="24"/>
-          <w:szCs w:val="24"/>
-        </w:rPr>
-        <w:t xml:space="preserve"> </w:t>
+        <w:t xml:space="preserve">User fills in the form correctly </w:t>
       </w:r>
     </w:p>
     <w:p>
@@ -5149,21 +5023,7 @@
           <w:sz w:val="24"/>
           <w:szCs w:val="24"/>
         </w:rPr>
-        <w:t>User presses “</w:t>
-      </w:r>
-      <w:r>
-        <w:rPr>
-          <w:sz w:val="24"/>
-          <w:szCs w:val="24"/>
-        </w:rPr>
-        <w:t>Add movie!</w:t>
-      </w:r>
-      <w:r>
-        <w:rPr>
-          <w:sz w:val="24"/>
-          <w:szCs w:val="24"/>
-        </w:rPr>
-        <w:t>”</w:t>
+        <w:t>User presses “Add movie!”</w:t>
       </w:r>
     </w:p>
     <w:p>
@@ -5179,14 +5039,7 @@
           <w:sz w:val="24"/>
           <w:szCs w:val="24"/>
         </w:rPr>
-        <w:t>System validates th</w:t>
-      </w:r>
-      <w:r>
-        <w:rPr>
-          <w:sz w:val="24"/>
-          <w:szCs w:val="24"/>
-        </w:rPr>
-        <w:t xml:space="preserve">e data and adds the movie to </w:t>
+        <w:t xml:space="preserve">System validates the data and adds the movie to </w:t>
       </w:r>
       <w:r>
         <w:rPr>
@@ -5241,25 +5094,18 @@
           <w:sz w:val="24"/>
           <w:szCs w:val="24"/>
         </w:rPr>
-        <w:t xml:space="preserve">System </w:t>
-      </w:r>
-      <w:r>
-        <w:rPr>
-          <w:sz w:val="24"/>
-          <w:szCs w:val="24"/>
-        </w:rPr>
-        <w:t xml:space="preserve">refreshes page </w:t>
+        <w:t xml:space="preserve">System refreshes page </w:t>
       </w:r>
     </w:p>
     <w:p>
       <w:pPr>
         <w:pStyle w:val="Heading3"/>
       </w:pPr>
-      <w:bookmarkStart w:id="27" w:name="_Toc192629001"/>
+      <w:bookmarkStart w:id="28" w:name="_Toc192629001"/>
       <w:r>
         <w:t>Extensions:</w:t>
       </w:r>
-      <w:bookmarkEnd w:id="27"/>
+      <w:bookmarkEnd w:id="28"/>
     </w:p>
     <w:p>
       <w:pPr>
@@ -5449,7 +5295,14 @@
           <w:sz w:val="24"/>
           <w:szCs w:val="24"/>
         </w:rPr>
-        <w:t>Primary Actor: User</w:t>
+        <w:t xml:space="preserve">Primary Actor: </w:t>
+      </w:r>
+      <w:r>
+        <w:rPr>
+          <w:sz w:val="24"/>
+          <w:szCs w:val="24"/>
+        </w:rPr>
+        <w:t>Movie watcher</w:t>
       </w:r>
     </w:p>
     <w:p>
@@ -5544,6 +5397,222 @@
           <w:sz w:val="24"/>
           <w:szCs w:val="24"/>
         </w:rPr>
+        <w:t>System ensures votes are sent through</w:t>
+      </w:r>
+    </w:p>
+    <w:p>
+      <w:pPr>
+        <w:pStyle w:val="ListParagraph"/>
+        <w:numPr>
+          <w:ilvl w:val="0"/>
+          <w:numId w:val="6"/>
+        </w:numPr>
+        <w:rPr>
+          <w:sz w:val="24"/>
+          <w:szCs w:val="24"/>
+        </w:rPr>
+      </w:pPr>
+      <w:r>
+        <w:rPr>
+          <w:sz w:val="24"/>
+          <w:szCs w:val="24"/>
+        </w:rPr>
+        <w:t>System ensures the correct movies are displayed</w:t>
+      </w:r>
+    </w:p>
+    <w:p>
+      <w:pPr>
+        <w:pStyle w:val="Heading3"/>
+      </w:pPr>
+      <w:r>
+        <w:t>Preconditions:</w:t>
+      </w:r>
+    </w:p>
+    <w:p>
+      <w:pPr>
+        <w:pStyle w:val="ListParagraph"/>
+        <w:numPr>
+          <w:ilvl w:val="0"/>
+          <w:numId w:val="7"/>
+        </w:numPr>
+        <w:rPr>
+          <w:sz w:val="24"/>
+          <w:szCs w:val="24"/>
+        </w:rPr>
+      </w:pPr>
+      <w:r>
+        <w:rPr>
+          <w:sz w:val="24"/>
+          <w:szCs w:val="24"/>
+        </w:rPr>
+        <w:t>Users must be logged in</w:t>
+      </w:r>
+    </w:p>
+    <w:p>
+      <w:pPr>
+        <w:pStyle w:val="Heading3"/>
+      </w:pPr>
+      <w:r>
+        <w:t>Guarantees:</w:t>
+      </w:r>
+    </w:p>
+    <w:p>
+      <w:pPr>
+        <w:pStyle w:val="ListParagraph"/>
+        <w:numPr>
+          <w:ilvl w:val="0"/>
+          <w:numId w:val="7"/>
+        </w:numPr>
+        <w:rPr>
+          <w:sz w:val="24"/>
+          <w:szCs w:val="24"/>
+        </w:rPr>
+      </w:pPr>
+      <w:r>
+        <w:rPr>
+          <w:sz w:val="24"/>
+          <w:szCs w:val="24"/>
+        </w:rPr>
+        <w:t>System adds movie to The List</w:t>
+      </w:r>
+    </w:p>
+    <w:p>
+      <w:pPr>
+        <w:pStyle w:val="ListParagraph"/>
+        <w:numPr>
+          <w:ilvl w:val="0"/>
+          <w:numId w:val="7"/>
+        </w:numPr>
+        <w:rPr>
+          <w:sz w:val="24"/>
+          <w:szCs w:val="24"/>
+        </w:rPr>
+      </w:pPr>
+      <w:r>
+        <w:rPr>
+          <w:sz w:val="24"/>
+          <w:szCs w:val="24"/>
+        </w:rPr>
+        <w:t>System remembers votes and vetoes of other users</w:t>
+      </w:r>
+    </w:p>
+    <w:p>
+      <w:pPr>
+        <w:pStyle w:val="ListParagraph"/>
+        <w:numPr>
+          <w:ilvl w:val="0"/>
+          <w:numId w:val="7"/>
+        </w:numPr>
+        <w:rPr>
+          <w:sz w:val="24"/>
+          <w:szCs w:val="24"/>
+        </w:rPr>
+      </w:pPr>
+      <w:r>
+        <w:rPr>
+          <w:sz w:val="24"/>
+          <w:szCs w:val="24"/>
+        </w:rPr>
+        <w:t>System prevents user from voting on their own suggestions</w:t>
+      </w:r>
+    </w:p>
+    <w:p>
+      <w:pPr>
+        <w:pStyle w:val="Heading3"/>
+      </w:pPr>
+      <w:r>
+        <w:t>Main success scenario:</w:t>
+      </w:r>
+    </w:p>
+    <w:p>
+      <w:pPr>
+        <w:pStyle w:val="ListParagraph"/>
+        <w:numPr>
+          <w:ilvl w:val="0"/>
+          <w:numId w:val="8"/>
+        </w:numPr>
+      </w:pPr>
+      <w:r>
+        <w:rPr>
+          <w:sz w:val="24"/>
+          <w:szCs w:val="24"/>
+        </w:rPr>
+        <w:t>User presses “</w:t>
+      </w:r>
+      <w:r>
+        <w:rPr>
+          <w:sz w:val="24"/>
+          <w:szCs w:val="24"/>
+        </w:rPr>
+        <w:t>Vote</w:t>
+      </w:r>
+      <w:r>
+        <w:rPr>
+          <w:sz w:val="24"/>
+          <w:szCs w:val="24"/>
+        </w:rPr>
+        <w:t>” button</w:t>
+      </w:r>
+    </w:p>
+    <w:p>
+      <w:pPr>
+        <w:pStyle w:val="ListParagraph"/>
+        <w:numPr>
+          <w:ilvl w:val="0"/>
+          <w:numId w:val="8"/>
+        </w:numPr>
+      </w:pPr>
+      <w:r>
+        <w:rPr>
+          <w:sz w:val="24"/>
+          <w:szCs w:val="24"/>
+        </w:rPr>
+        <w:t>Syste</w:t>
+      </w:r>
+      <w:r>
+        <w:rPr>
+          <w:sz w:val="24"/>
+          <w:szCs w:val="24"/>
+        </w:rPr>
+        <w:t>m provides overview of movies, with trailer, that are in the contender list</w:t>
+      </w:r>
+    </w:p>
+    <w:p>
+      <w:pPr>
+        <w:pStyle w:val="ListParagraph"/>
+        <w:numPr>
+          <w:ilvl w:val="0"/>
+          <w:numId w:val="8"/>
+        </w:numPr>
+      </w:pPr>
+      <w:r>
+        <w:rPr>
+          <w:sz w:val="24"/>
+          <w:szCs w:val="24"/>
+        </w:rPr>
+        <w:t xml:space="preserve">User </w:t>
+      </w:r>
+      <w:r>
+        <w:rPr>
+          <w:sz w:val="24"/>
+          <w:szCs w:val="24"/>
+        </w:rPr>
+        <w:t>votes or vetoes said movie</w:t>
+      </w:r>
+    </w:p>
+    <w:p>
+      <w:pPr>
+        <w:pStyle w:val="ListParagraph"/>
+        <w:numPr>
+          <w:ilvl w:val="0"/>
+          <w:numId w:val="8"/>
+        </w:numPr>
+      </w:pPr>
+      <w:r>
+        <w:rPr>
+          <w:sz w:val="24"/>
+          <w:szCs w:val="24"/>
+        </w:rPr>
         <w:t xml:space="preserve">System </w:t>
       </w:r>
       <w:r>
@@ -5551,34 +5620,101 @@
           <w:sz w:val="24"/>
           <w:szCs w:val="24"/>
         </w:rPr>
-        <w:t>ensures votes are sent through</w:t>
-      </w:r>
-    </w:p>
-    <w:p>
-      <w:pPr>
-        <w:pStyle w:val="ListParagraph"/>
-        <w:numPr>
-          <w:ilvl w:val="0"/>
-          <w:numId w:val="6"/>
-        </w:numPr>
-        <w:rPr>
-          <w:sz w:val="24"/>
-          <w:szCs w:val="24"/>
-        </w:rPr>
-      </w:pPr>
-      <w:r>
-        <w:rPr>
-          <w:sz w:val="24"/>
-          <w:szCs w:val="24"/>
-        </w:rPr>
-        <w:t xml:space="preserve">System ensures the correct movies </w:t>
-      </w:r>
-      <w:r>
-        <w:rPr>
-          <w:sz w:val="24"/>
-          <w:szCs w:val="24"/>
-        </w:rPr>
-        <w:t>are displayed</w:t>
+        <w:t>registers user vote or veto</w:t>
+      </w:r>
+    </w:p>
+    <w:p>
+      <w:pPr>
+        <w:pStyle w:val="ListParagraph"/>
+        <w:numPr>
+          <w:ilvl w:val="0"/>
+          <w:numId w:val="8"/>
+        </w:numPr>
+      </w:pPr>
+      <w:r>
+        <w:rPr>
+          <w:sz w:val="24"/>
+          <w:szCs w:val="24"/>
+        </w:rPr>
+        <w:t>System checks if movie is added by same user</w:t>
+      </w:r>
+    </w:p>
+    <w:p>
+      <w:pPr>
+        <w:pStyle w:val="ListParagraph"/>
+        <w:numPr>
+          <w:ilvl w:val="0"/>
+          <w:numId w:val="8"/>
+        </w:numPr>
+      </w:pPr>
+      <w:r>
+        <w:rPr>
+          <w:sz w:val="24"/>
+          <w:szCs w:val="24"/>
+        </w:rPr>
+        <w:t>System remembers that user voted on the movie</w:t>
+      </w:r>
+    </w:p>
+    <w:p>
+      <w:pPr>
+        <w:pStyle w:val="ListParagraph"/>
+        <w:numPr>
+          <w:ilvl w:val="0"/>
+          <w:numId w:val="8"/>
+        </w:numPr>
+      </w:pPr>
+      <w:r>
+        <w:rPr>
+          <w:sz w:val="24"/>
+          <w:szCs w:val="24"/>
+        </w:rPr>
+        <w:t>System</w:t>
+      </w:r>
+      <w:r>
+        <w:rPr>
+          <w:sz w:val="24"/>
+          <w:szCs w:val="24"/>
+        </w:rPr>
+        <w:t xml:space="preserve"> confirms to user that the vote has been added</w:t>
+      </w:r>
+    </w:p>
+    <w:p>
+      <w:pPr>
+        <w:pStyle w:val="ListParagraph"/>
+        <w:numPr>
+          <w:ilvl w:val="0"/>
+          <w:numId w:val="8"/>
+        </w:numPr>
+      </w:pPr>
+      <w:r>
+        <w:rPr>
+          <w:sz w:val="24"/>
+          <w:szCs w:val="24"/>
+        </w:rPr>
+        <w:t>System removes movies in which user has already voted</w:t>
+      </w:r>
+    </w:p>
+    <w:p>
+      <w:pPr>
+        <w:pStyle w:val="ListParagraph"/>
+        <w:numPr>
+          <w:ilvl w:val="0"/>
+          <w:numId w:val="8"/>
+        </w:numPr>
+      </w:pPr>
+      <w:r>
+        <w:rPr>
+          <w:sz w:val="24"/>
+          <w:szCs w:val="24"/>
+        </w:rPr>
+        <w:t>System refreshes page</w:t>
+      </w:r>
+      <w:r>
+        <w:rPr>
+          <w:sz w:val="24"/>
+          <w:szCs w:val="24"/>
+        </w:rPr>
+        <w:t xml:space="preserve"> </w:t>
       </w:r>
     </w:p>
     <w:p>
@@ -5586,71 +5722,55 @@
         <w:pStyle w:val="Heading3"/>
       </w:pPr>
       <w:r>
-        <w:t>Preconditions:</w:t>
-      </w:r>
-    </w:p>
-    <w:p>
-      <w:pPr>
-        <w:pStyle w:val="ListParagraph"/>
-        <w:numPr>
-          <w:ilvl w:val="0"/>
-          <w:numId w:val="7"/>
-        </w:numPr>
-        <w:rPr>
-          <w:sz w:val="24"/>
-          <w:szCs w:val="24"/>
-        </w:rPr>
-      </w:pPr>
-      <w:r>
-        <w:rPr>
-          <w:sz w:val="24"/>
-          <w:szCs w:val="24"/>
-        </w:rPr>
-        <w:t>Users must be logged in</w:t>
-      </w:r>
-    </w:p>
-    <w:p>
-      <w:pPr>
-        <w:pStyle w:val="Heading3"/>
-      </w:pPr>
-      <w:r>
-        <w:t>Guarantees:</w:t>
-      </w:r>
-    </w:p>
-    <w:p>
-      <w:pPr>
-        <w:pStyle w:val="ListParagraph"/>
-        <w:numPr>
-          <w:ilvl w:val="0"/>
-          <w:numId w:val="7"/>
-        </w:numPr>
-        <w:rPr>
-          <w:sz w:val="24"/>
-          <w:szCs w:val="24"/>
-        </w:rPr>
-      </w:pPr>
-      <w:r>
-        <w:rPr>
-          <w:sz w:val="24"/>
-          <w:szCs w:val="24"/>
-        </w:rPr>
-        <w:t xml:space="preserve">System adds </w:t>
-      </w:r>
-      <w:r>
-        <w:rPr>
-          <w:sz w:val="24"/>
-          <w:szCs w:val="24"/>
-        </w:rPr>
-        <w:t>movie to The List</w:t>
-      </w:r>
-    </w:p>
-    <w:p>
-      <w:pPr>
-        <w:pStyle w:val="ListParagraph"/>
-        <w:numPr>
-          <w:ilvl w:val="0"/>
-          <w:numId w:val="7"/>
-        </w:numPr>
+        <w:t>Extensions:</w:t>
+      </w:r>
+    </w:p>
+    <w:p>
+      <w:pPr>
+        <w:pStyle w:val="Heading4"/>
+        <w:rPr>
+          <w:sz w:val="24"/>
+          <w:szCs w:val="24"/>
+        </w:rPr>
+      </w:pPr>
+      <w:r>
+        <w:rPr>
+          <w:sz w:val="24"/>
+          <w:szCs w:val="24"/>
+        </w:rPr>
+        <w:t>S</w:t>
+      </w:r>
+      <w:r>
+        <w:rPr>
+          <w:sz w:val="24"/>
+          <w:szCs w:val="24"/>
+        </w:rPr>
+        <w:t>ystem displays movies in which user has voted</w:t>
+      </w:r>
+    </w:p>
+    <w:p>
+      <w:pPr>
+        <w:pStyle w:val="ListParagraph"/>
+        <w:numPr>
+          <w:ilvl w:val="0"/>
+          <w:numId w:val="11"/>
+        </w:numPr>
+        <w:rPr>
+          <w:sz w:val="24"/>
+          <w:szCs w:val="24"/>
+        </w:rPr>
+      </w:pPr>
+      <w:r>
+        <w:rPr>
+          <w:sz w:val="24"/>
+          <w:szCs w:val="24"/>
+        </w:rPr>
+        <w:t>Buttons will be disabled for user. If voting was attempted error message will pop up saying “Vote already added”</w:t>
+      </w:r>
+    </w:p>
+    <w:p>
+      <w:pPr>
+        <w:pStyle w:val="Heading4"/>
         <w:rPr>
           <w:sz w:val="24"/>
           <w:szCs w:val="24"/>
@@ -5668,243 +5788,27 @@
           <w:sz w:val="24"/>
           <w:szCs w:val="24"/>
         </w:rPr>
-        <w:t>remembers votes and vetoes of other users</w:t>
-      </w:r>
-    </w:p>
-    <w:p>
-      <w:pPr>
-        <w:pStyle w:val="ListParagraph"/>
-        <w:numPr>
-          <w:ilvl w:val="0"/>
-          <w:numId w:val="7"/>
-        </w:numPr>
-        <w:rPr>
-          <w:sz w:val="24"/>
-          <w:szCs w:val="24"/>
-        </w:rPr>
-      </w:pPr>
-      <w:r>
-        <w:rPr>
-          <w:sz w:val="24"/>
-          <w:szCs w:val="24"/>
-        </w:rPr>
-        <w:t xml:space="preserve">System </w:t>
-      </w:r>
-      <w:r>
-        <w:rPr>
-          <w:sz w:val="24"/>
-          <w:szCs w:val="24"/>
-        </w:rPr>
-        <w:t>prevents user from voting on their own suggestions</w:t>
-      </w:r>
-    </w:p>
-    <w:p>
-      <w:pPr>
-        <w:pStyle w:val="Heading3"/>
-      </w:pPr>
-      <w:r>
-        <w:t>Main success scenario:</w:t>
-      </w:r>
-    </w:p>
-    <w:p>
-      <w:pPr>
-        <w:pStyle w:val="ListParagraph"/>
-        <w:numPr>
-          <w:ilvl w:val="0"/>
-          <w:numId w:val="8"/>
-        </w:numPr>
-      </w:pPr>
-      <w:r>
-        <w:rPr>
-          <w:sz w:val="24"/>
-          <w:szCs w:val="24"/>
-        </w:rPr>
-        <w:t>User presses “</w:t>
-      </w:r>
-      <w:r>
-        <w:rPr>
-          <w:sz w:val="24"/>
-          <w:szCs w:val="24"/>
-        </w:rPr>
-        <w:t>Vote</w:t>
-      </w:r>
-      <w:r>
-        <w:rPr>
-          <w:sz w:val="24"/>
-          <w:szCs w:val="24"/>
-        </w:rPr>
-        <w:t>” button</w:t>
-      </w:r>
-    </w:p>
-    <w:p>
-      <w:pPr>
-        <w:pStyle w:val="ListParagraph"/>
-        <w:numPr>
-          <w:ilvl w:val="0"/>
-          <w:numId w:val="8"/>
-        </w:numPr>
-      </w:pPr>
-      <w:r>
-        <w:rPr>
-          <w:sz w:val="24"/>
-          <w:szCs w:val="24"/>
-        </w:rPr>
-        <w:t>Syste</w:t>
-      </w:r>
-      <w:r>
-        <w:rPr>
-          <w:sz w:val="24"/>
-          <w:szCs w:val="24"/>
-        </w:rPr>
-        <w:t>m provides overview of movies, with trailer, that are in the contender list</w:t>
-      </w:r>
-    </w:p>
-    <w:p>
-      <w:pPr>
-        <w:pStyle w:val="ListParagraph"/>
-        <w:numPr>
-          <w:ilvl w:val="0"/>
-          <w:numId w:val="8"/>
-        </w:numPr>
-      </w:pPr>
-      <w:r>
-        <w:rPr>
-          <w:sz w:val="24"/>
-          <w:szCs w:val="24"/>
-        </w:rPr>
-        <w:t xml:space="preserve">User </w:t>
-      </w:r>
-      <w:r>
-        <w:rPr>
-          <w:sz w:val="24"/>
-          <w:szCs w:val="24"/>
-        </w:rPr>
-        <w:t>votes or vetoes said movie</w:t>
-      </w:r>
-    </w:p>
-    <w:p>
-      <w:pPr>
-        <w:pStyle w:val="ListParagraph"/>
-        <w:numPr>
-          <w:ilvl w:val="0"/>
-          <w:numId w:val="8"/>
-        </w:numPr>
-      </w:pPr>
-      <w:r>
-        <w:rPr>
-          <w:sz w:val="24"/>
-          <w:szCs w:val="24"/>
-        </w:rPr>
-        <w:t xml:space="preserve">System </w:t>
-      </w:r>
-      <w:r>
-        <w:rPr>
-          <w:sz w:val="24"/>
-          <w:szCs w:val="24"/>
-        </w:rPr>
-        <w:t>registers user vote or veto</w:t>
-      </w:r>
-    </w:p>
-    <w:p>
-      <w:pPr>
-        <w:pStyle w:val="ListParagraph"/>
-        <w:numPr>
-          <w:ilvl w:val="0"/>
-          <w:numId w:val="8"/>
-        </w:numPr>
-      </w:pPr>
-      <w:r>
-        <w:rPr>
-          <w:sz w:val="24"/>
-          <w:szCs w:val="24"/>
-        </w:rPr>
-        <w:t>System checks if movie is added by same user</w:t>
-      </w:r>
-    </w:p>
-    <w:p>
-      <w:pPr>
-        <w:pStyle w:val="ListParagraph"/>
-        <w:numPr>
-          <w:ilvl w:val="0"/>
-          <w:numId w:val="8"/>
-        </w:numPr>
-      </w:pPr>
-      <w:r>
-        <w:rPr>
-          <w:sz w:val="24"/>
-          <w:szCs w:val="24"/>
-        </w:rPr>
-        <w:t>System remembers that user voted on the movie</w:t>
-      </w:r>
-    </w:p>
-    <w:p>
-      <w:pPr>
-        <w:pStyle w:val="ListParagraph"/>
-        <w:numPr>
-          <w:ilvl w:val="0"/>
-          <w:numId w:val="8"/>
-        </w:numPr>
-      </w:pPr>
-      <w:r>
-        <w:rPr>
-          <w:sz w:val="24"/>
-          <w:szCs w:val="24"/>
-        </w:rPr>
-        <w:t>System</w:t>
-      </w:r>
-      <w:r>
-        <w:rPr>
-          <w:sz w:val="24"/>
-          <w:szCs w:val="24"/>
-        </w:rPr>
-        <w:t xml:space="preserve"> confirms to user that the vote has been added</w:t>
-      </w:r>
-    </w:p>
-    <w:p>
-      <w:pPr>
-        <w:pStyle w:val="ListParagraph"/>
-        <w:numPr>
-          <w:ilvl w:val="0"/>
-          <w:numId w:val="8"/>
-        </w:numPr>
-      </w:pPr>
-      <w:r>
-        <w:rPr>
-          <w:sz w:val="24"/>
-          <w:szCs w:val="24"/>
-        </w:rPr>
-        <w:t>System removes movies in which user has already voted</w:t>
-      </w:r>
-    </w:p>
-    <w:p>
-      <w:pPr>
-        <w:pStyle w:val="ListParagraph"/>
-        <w:numPr>
-          <w:ilvl w:val="0"/>
-          <w:numId w:val="8"/>
-        </w:numPr>
-      </w:pPr>
-      <w:r>
-        <w:rPr>
-          <w:sz w:val="24"/>
-          <w:szCs w:val="24"/>
-        </w:rPr>
-        <w:t>System refreshes page</w:t>
-      </w:r>
-      <w:r>
-        <w:rPr>
-          <w:sz w:val="24"/>
-          <w:szCs w:val="24"/>
-        </w:rPr>
-        <w:t xml:space="preserve"> </w:t>
-      </w:r>
-    </w:p>
-    <w:p>
-      <w:pPr>
-        <w:pStyle w:val="Heading3"/>
-      </w:pPr>
-      <w:r>
-        <w:t>Extensions:</w:t>
+        <w:t>displays movies that user added themselves</w:t>
+      </w:r>
+    </w:p>
+    <w:p>
+      <w:pPr>
+        <w:pStyle w:val="ListParagraph"/>
+        <w:numPr>
+          <w:ilvl w:val="0"/>
+          <w:numId w:val="11"/>
+        </w:numPr>
+        <w:rPr>
+          <w:sz w:val="24"/>
+          <w:szCs w:val="24"/>
+        </w:rPr>
+      </w:pPr>
+      <w:r>
+        <w:rPr>
+          <w:sz w:val="24"/>
+          <w:szCs w:val="24"/>
+        </w:rPr>
+        <w:t>Buttons should be disabled for user. If voting is attempted, error message will pop up with “You added this yourself”</w:t>
       </w:r>
     </w:p>
     <w:p>
@@ -5920,14 +5824,7 @@
           <w:sz w:val="24"/>
           <w:szCs w:val="24"/>
         </w:rPr>
-        <w:t>S</w:t>
-      </w:r>
-      <w:r>
-        <w:rPr>
-          <w:sz w:val="24"/>
-          <w:szCs w:val="24"/>
-        </w:rPr>
-        <w:t>ystem displays movies in which user has voted</w:t>
+        <w:t>User attempts to vote without watching the trailer</w:t>
       </w:r>
     </w:p>
     <w:p>
@@ -5947,85 +5844,6 @@
           <w:sz w:val="24"/>
           <w:szCs w:val="24"/>
         </w:rPr>
-        <w:t>Buttons will be disabled for user. If voting was attempted error message will pop up saying “Vote already added”</w:t>
-      </w:r>
-    </w:p>
-    <w:p>
-      <w:pPr>
-        <w:pStyle w:val="Heading4"/>
-        <w:rPr>
-          <w:sz w:val="24"/>
-          <w:szCs w:val="24"/>
-        </w:rPr>
-      </w:pPr>
-      <w:r>
-        <w:rPr>
-          <w:sz w:val="24"/>
-          <w:szCs w:val="24"/>
-        </w:rPr>
-        <w:t xml:space="preserve">System </w:t>
-      </w:r>
-      <w:r>
-        <w:rPr>
-          <w:sz w:val="24"/>
-          <w:szCs w:val="24"/>
-        </w:rPr>
-        <w:t>displays movies that user added themselves</w:t>
-      </w:r>
-    </w:p>
-    <w:p>
-      <w:pPr>
-        <w:pStyle w:val="ListParagraph"/>
-        <w:numPr>
-          <w:ilvl w:val="0"/>
-          <w:numId w:val="11"/>
-        </w:numPr>
-        <w:rPr>
-          <w:sz w:val="24"/>
-          <w:szCs w:val="24"/>
-        </w:rPr>
-      </w:pPr>
-      <w:r>
-        <w:rPr>
-          <w:sz w:val="24"/>
-          <w:szCs w:val="24"/>
-        </w:rPr>
-        <w:t>Buttons should be disabled for user. If voting is attempted, error message will pop up with “You added this yourself”</w:t>
-      </w:r>
-    </w:p>
-    <w:p>
-      <w:pPr>
-        <w:pStyle w:val="Heading4"/>
-        <w:rPr>
-          <w:sz w:val="24"/>
-          <w:szCs w:val="24"/>
-        </w:rPr>
-      </w:pPr>
-      <w:r>
-        <w:rPr>
-          <w:sz w:val="24"/>
-          <w:szCs w:val="24"/>
-        </w:rPr>
-        <w:t>User attempts to vote without watching the trailer</w:t>
-      </w:r>
-    </w:p>
-    <w:p>
-      <w:pPr>
-        <w:pStyle w:val="ListParagraph"/>
-        <w:numPr>
-          <w:ilvl w:val="0"/>
-          <w:numId w:val="11"/>
-        </w:numPr>
-        <w:rPr>
-          <w:sz w:val="24"/>
-          <w:szCs w:val="24"/>
-        </w:rPr>
-      </w:pPr>
-      <w:r>
-        <w:rPr>
-          <w:sz w:val="24"/>
-          <w:szCs w:val="24"/>
-        </w:rPr>
         <w:t>Pop up message with “Are you sure” will appear</w:t>
       </w:r>
     </w:p>
@@ -6033,7 +5851,7 @@
       <w:pPr>
         <w:pStyle w:val="Heading2"/>
       </w:pPr>
-      <w:bookmarkStart w:id="28" w:name="_Toc192629002"/>
+      <w:bookmarkStart w:id="29" w:name="_Toc192629002"/>
       <w:r>
         <w:lastRenderedPageBreak/>
         <w:t>Use Case</w:t>
@@ -6044,7 +5862,7 @@
       <w:r>
         <w:t>views The List</w:t>
       </w:r>
-      <w:bookmarkEnd w:id="28"/>
+      <w:bookmarkEnd w:id="29"/>
     </w:p>
     <w:p>
       <w:pPr>
@@ -6063,7 +5881,14 @@
           <w:sz w:val="24"/>
           <w:szCs w:val="24"/>
         </w:rPr>
-        <w:t>Primary Actor: User</w:t>
+        <w:t xml:space="preserve">Primary Actor: </w:t>
+      </w:r>
+      <w:r>
+        <w:rPr>
+          <w:sz w:val="24"/>
+          <w:szCs w:val="24"/>
+        </w:rPr>
+        <w:t>Movie watcher</w:t>
       </w:r>
     </w:p>
     <w:p>
@@ -6110,11 +5935,11 @@
       <w:pPr>
         <w:pStyle w:val="Heading3"/>
       </w:pPr>
-      <w:bookmarkStart w:id="29" w:name="_Toc192629003"/>
+      <w:bookmarkStart w:id="30" w:name="_Toc192629003"/>
       <w:r>
         <w:t>Stakeholder &amp; Interests:</w:t>
       </w:r>
-      <w:bookmarkEnd w:id="29"/>
+      <w:bookmarkEnd w:id="30"/>
     </w:p>
     <w:p>
       <w:pPr>
@@ -6140,7 +5965,23 @@
           <w:sz w:val="24"/>
           <w:szCs w:val="24"/>
         </w:rPr>
-        <w:t>has an overview of three categories of the list: Watched, Not watched and Currently watching</w:t>
+        <w:t xml:space="preserve">has an overview of three categories of the list: Watched, </w:t>
+      </w:r>
+      <w:proofErr w:type="gramStart"/>
+      <w:r>
+        <w:rPr>
+          <w:sz w:val="24"/>
+          <w:szCs w:val="24"/>
+        </w:rPr>
+        <w:t>Not</w:t>
+      </w:r>
+      <w:proofErr w:type="gramEnd"/>
+      <w:r>
+        <w:rPr>
+          <w:sz w:val="24"/>
+          <w:szCs w:val="24"/>
+        </w:rPr>
+        <w:t xml:space="preserve"> watched and Currently watching</w:t>
       </w:r>
     </w:p>
     <w:p>
@@ -6160,25 +6001,18 @@
           <w:sz w:val="24"/>
           <w:szCs w:val="24"/>
         </w:rPr>
-        <w:t xml:space="preserve">System </w:t>
-      </w:r>
-      <w:r>
-        <w:rPr>
-          <w:sz w:val="24"/>
-          <w:szCs w:val="24"/>
-        </w:rPr>
-        <w:t>ensures the data is separated correctly</w:t>
+        <w:t>System ensures the data is separated correctly</w:t>
       </w:r>
     </w:p>
     <w:p>
       <w:pPr>
         <w:pStyle w:val="Heading3"/>
       </w:pPr>
-      <w:bookmarkStart w:id="30" w:name="_Toc192629004"/>
+      <w:bookmarkStart w:id="31" w:name="_Toc192629004"/>
       <w:r>
         <w:t>Preconditions:</w:t>
       </w:r>
-      <w:bookmarkEnd w:id="30"/>
+      <w:bookmarkEnd w:id="31"/>
     </w:p>
     <w:p>
       <w:pPr>
@@ -6197,25 +6031,18 @@
           <w:sz w:val="24"/>
           <w:szCs w:val="24"/>
         </w:rPr>
-        <w:t xml:space="preserve">Users must </w:t>
-      </w:r>
-      <w:r>
-        <w:rPr>
-          <w:sz w:val="24"/>
-          <w:szCs w:val="24"/>
-        </w:rPr>
-        <w:t>be logged in</w:t>
+        <w:t>Users must be logged in</w:t>
       </w:r>
     </w:p>
     <w:p>
       <w:pPr>
         <w:pStyle w:val="Heading3"/>
       </w:pPr>
-      <w:bookmarkStart w:id="31" w:name="_Toc192629005"/>
+      <w:bookmarkStart w:id="32" w:name="_Toc192629005"/>
       <w:r>
         <w:t>Guarantees:</w:t>
       </w:r>
-      <w:bookmarkEnd w:id="31"/>
+      <w:bookmarkEnd w:id="32"/>
     </w:p>
     <w:p>
       <w:pPr>
@@ -6234,25 +6061,18 @@
           <w:sz w:val="24"/>
           <w:szCs w:val="24"/>
         </w:rPr>
-        <w:t xml:space="preserve">System </w:t>
-      </w:r>
-      <w:r>
-        <w:rPr>
-          <w:sz w:val="24"/>
-          <w:szCs w:val="24"/>
-        </w:rPr>
-        <w:t>displays data correctly</w:t>
+        <w:t>System displays data correctly</w:t>
       </w:r>
     </w:p>
     <w:p>
       <w:pPr>
         <w:pStyle w:val="Heading3"/>
       </w:pPr>
-      <w:bookmarkStart w:id="32" w:name="_Toc192629006"/>
+      <w:bookmarkStart w:id="33" w:name="_Toc192629006"/>
       <w:r>
         <w:t>Main success scenario:</w:t>
       </w:r>
-      <w:bookmarkEnd w:id="32"/>
+      <w:bookmarkEnd w:id="33"/>
     </w:p>
     <w:p>
       <w:pPr>
@@ -6267,21 +6087,7 @@
           <w:sz w:val="24"/>
           <w:szCs w:val="24"/>
         </w:rPr>
-        <w:t>User presses “</w:t>
-      </w:r>
-      <w:r>
-        <w:rPr>
-          <w:sz w:val="24"/>
-          <w:szCs w:val="24"/>
-        </w:rPr>
-        <w:t>Overview</w:t>
-      </w:r>
-      <w:r>
-        <w:rPr>
-          <w:sz w:val="24"/>
-          <w:szCs w:val="24"/>
-        </w:rPr>
-        <w:t>” button</w:t>
+        <w:t>User presses “Overview” button</w:t>
       </w:r>
     </w:p>
     <w:p>
@@ -6297,14 +6103,7 @@
           <w:sz w:val="24"/>
           <w:szCs w:val="24"/>
         </w:rPr>
-        <w:t xml:space="preserve">System provides </w:t>
-      </w:r>
-      <w:r>
-        <w:rPr>
-          <w:sz w:val="24"/>
-          <w:szCs w:val="24"/>
-        </w:rPr>
-        <w:t>overview page of The List</w:t>
+        <w:t>System provides overview page of The List</w:t>
       </w:r>
     </w:p>
     <w:p>
@@ -6327,11 +6126,11 @@
       <w:pPr>
         <w:pStyle w:val="Heading3"/>
       </w:pPr>
-      <w:bookmarkStart w:id="33" w:name="_Toc192629007"/>
+      <w:bookmarkStart w:id="34" w:name="_Toc192629007"/>
       <w:r>
         <w:t>Extensions:</w:t>
       </w:r>
-      <w:bookmarkEnd w:id="33"/>
+      <w:bookmarkEnd w:id="34"/>
     </w:p>
     <w:p>
       <w:pPr>
@@ -6436,7 +6235,14 @@
           <w:sz w:val="24"/>
           <w:szCs w:val="24"/>
         </w:rPr>
-        <w:t>Primary Actor: User</w:t>
+        <w:t xml:space="preserve">Primary Actor: </w:t>
+      </w:r>
+      <w:r>
+        <w:rPr>
+          <w:sz w:val="24"/>
+          <w:szCs w:val="24"/>
+        </w:rPr>
+        <w:t>Movie watcher</w:t>
       </w:r>
     </w:p>
     <w:p>
@@ -6911,7 +6717,14 @@
           <w:sz w:val="24"/>
           <w:szCs w:val="24"/>
         </w:rPr>
-        <w:t>Primary Actor: User</w:t>
+        <w:t xml:space="preserve">Primary Actor: </w:t>
+      </w:r>
+      <w:r>
+        <w:rPr>
+          <w:sz w:val="24"/>
+          <w:szCs w:val="24"/>
+        </w:rPr>
+        <w:t>Movie watcher</w:t>
       </w:r>
     </w:p>
     <w:p>
@@ -7041,14 +6854,7 @@
           <w:sz w:val="24"/>
           <w:szCs w:val="24"/>
         </w:rPr>
-        <w:t xml:space="preserve">Users </w:t>
-      </w:r>
-      <w:r>
-        <w:rPr>
-          <w:sz w:val="24"/>
-          <w:szCs w:val="24"/>
-        </w:rPr>
-        <w:t>must be logged in</w:t>
+        <w:t>Users must be logged in</w:t>
       </w:r>
     </w:p>
     <w:p>
@@ -7266,12 +7072,12 @@
       <w:pPr>
         <w:pStyle w:val="Heading1"/>
       </w:pPr>
-      <w:bookmarkStart w:id="34" w:name="_Toc192629008"/>
+      <w:bookmarkStart w:id="35" w:name="_Toc192629008"/>
       <w:r>
         <w:lastRenderedPageBreak/>
         <w:t>Conceptual Diagram</w:t>
       </w:r>
-      <w:bookmarkEnd w:id="34"/>
+      <w:bookmarkEnd w:id="35"/>
     </w:p>
     <w:sectPr>
       <w:pgSz w:w="12240" w:h="15840"/>

</xml_diff>